<commit_message>
html css task 1
</commit_message>
<xml_diff>
--- a/LEARNING_PYTHON_BASICS.docx
+++ b/LEARNING_PYTHON_BASICS.docx
@@ -61,8 +61,6 @@
         </w:rPr>
         <w:t xml:space="preserve">#Counting Characters in a String: </w:t>
       </w:r>
-      <w:bookmarkStart w:id="0" w:name="_GoBack"/>
-      <w:bookmarkEnd w:id="0"/>
     </w:p>
     <w:p>
       <w:pPr>
@@ -1459,6 +1457,7 @@
             <w:insideH w:val="none" w:color="auto" w:sz="0" w:space="0"/>
             <w:insideV w:val="none" w:color="auto" w:sz="0" w:space="0"/>
           </w:tblBorders>
+          <w:shd w:val="clear"/>
           <w:tblCellMar>
             <w:top w:w="15" w:type="dxa"/>
             <w:left w:w="15" w:type="dxa"/>
@@ -2683,6 +2682,7 @@
             <w:insideH w:val="none" w:color="auto" w:sz="0" w:space="0"/>
             <w:insideV w:val="none" w:color="auto" w:sz="0" w:space="0"/>
           </w:tblBorders>
+          <w:shd w:val="clear"/>
           <w:tblCellMar>
             <w:top w:w="15" w:type="dxa"/>
             <w:left w:w="15" w:type="dxa"/>
@@ -12154,8 +12154,11 @@
           <w:b w:val="0"/>
           <w:bCs w:val="0"/>
           <w:color w:val="CCCCCC"/>
-          <w:sz w:val="16"/>
-          <w:szCs w:val="16"/>
+          <w:kern w:val="0"/>
+          <w:sz w:val="16"/>
+          <w:szCs w:val="16"/>
+          <w:shd w:val="clear" w:fill="1F1F1F"/>
+          <w:lang w:val="en-US" w:eastAsia="zh-CN" w:bidi="ar"/>
         </w:rPr>
       </w:pPr>
       <w:r>
@@ -12174,6 +12177,32 @@
       </w:r>
     </w:p>
     <w:p/>
+    <w:p/>
+    <w:p>
+      <w:pPr>
+        <w:rPr>
+          <w:rFonts w:hint="default"/>
+          <w:lang w:val="en-US"/>
+        </w:rPr>
+      </w:pPr>
+      <w:r>
+        <w:rPr>
+          <w:rFonts w:hint="default"/>
+          <w:lang w:val="en-US"/>
+        </w:rPr>
+        <w:t>GIT LINK:</w:t>
+      </w:r>
+      <w:r>
+        <w:rPr>
+          <w:rFonts w:hint="default"/>
+          <w:color w:val="0000FF"/>
+          <w:lang w:val="en-US"/>
+        </w:rPr>
+        <w:t xml:space="preserve"> https://github.com/YuvadharshiniM/Tridots_learning</w:t>
+      </w:r>
+      <w:bookmarkStart w:id="0" w:name="_GoBack"/>
+      <w:bookmarkEnd w:id="0"/>
+    </w:p>
     <w:sectPr>
       <w:cols w:space="0" w:num="1"/>
     </w:sectPr>

</xml_diff>